<commit_message>
Finalize canonical ECG reference results
</commit_message>
<xml_diff>
--- a/table.docx
+++ b/table.docx
@@ -2,18 +2,6 @@
 <file path=word/document.xml><?xml version="1.0" encoding="utf-8"?>
 <w:document xmlns:wpc="http://schemas.microsoft.com/office/word/2010/wordprocessingCanvas" xmlns:cx="http://schemas.microsoft.com/office/drawing/2014/chartex" xmlns:cx1="http://schemas.microsoft.com/office/drawing/2015/9/8/chartex" xmlns:cx2="http://schemas.microsoft.com/office/drawing/2015/10/21/chartex" xmlns:cx3="http://schemas.microsoft.com/office/drawing/2016/5/9/chartex" xmlns:cx4="http://schemas.microsoft.com/office/drawing/2016/5/10/chartex" xmlns:cx5="http://schemas.microsoft.com/office/drawing/2016/5/11/chartex" xmlns:cx6="http://schemas.microsoft.com/office/drawing/2016/5/12/chartex" xmlns:cx7="http://schemas.microsoft.com/office/drawing/2016/5/13/chartex" xmlns:cx8="http://schemas.microsoft.com/office/drawing/2016/5/14/chartex" xmlns:mc="http://schemas.openxmlformats.org/markup-compatibility/2006" xmlns:aink="http://schemas.microsoft.com/office/drawing/2016/ink" xmlns:am3d="http://schemas.microsoft.com/office/drawing/2017/model3d" xmlns:o="urn:schemas-microsoft-com:office:office" xmlns:oel="http://schemas.microsoft.com/office/2019/extlst" xmlns:r="http://schemas.openxmlformats.org/officeDocument/2006/relationships" xmlns:m="http://schemas.openxmlformats.org/officeDocument/2006/math" xmlns:v="urn:schemas-microsoft-com:vml" xmlns:wp14="http://schemas.microsoft.com/office/word/2010/wordprocessingDrawing" xmlns:wp="http://schemas.openxmlformats.org/drawingml/2006/wordprocessingDrawing" xmlns:w10="urn:schemas-microsoft-com:office:word" xmlns:w="http://schemas.openxmlformats.org/wordprocessingml/2006/main" xmlns:w14="http://schemas.microsoft.com/office/word/2010/wordml" xmlns:w15="http://schemas.microsoft.com/office/word/2012/wordml" xmlns:w16cex="http://schemas.microsoft.com/office/word/2018/wordml/cex" xmlns:w16cid="http://schemas.microsoft.com/office/word/2016/wordml/cid" xmlns:w16="http://schemas.microsoft.com/office/word/2018/wordml" xmlns:w16du="http://schemas.microsoft.com/office/word/2023/wordml/word16du" xmlns:w16sdtdh="http://schemas.microsoft.com/office/word/2020/wordml/sdtdatahash" xmlns:w16sdtfl="http://schemas.microsoft.com/office/word/2024/wordml/sdtformatlock" xmlns:w16se="http://schemas.microsoft.com/office/word/2015/wordml/symex" xmlns:wpg="http://schemas.microsoft.com/office/word/2010/wordprocessingGroup" xmlns:wpi="http://schemas.microsoft.com/office/word/2010/wordprocessingInk" xmlns:wne="http://schemas.microsoft.com/office/word/2006/wordml" xmlns:wps="http://schemas.microsoft.com/office/word/2010/wordprocessingShape" mc:Ignorable="w14 w15 w16se w16cid w16 w16cex w16sdtdh w16sdtfl w16du wp14">
   <w:body>
-    <w:p>
-      <w:pPr>
-        <w:jc w:val="center"/>
-      </w:pPr>
-      <w:r>
-        <w:rPr>
-          <w:b/>
-          <w:sz w:val="28"/>
-        </w:rPr>
-        <w:t>Table 2</w:t>
-      </w:r>
-    </w:p>
     <w:p>
       <w:pPr>
         <w:jc w:val="center"/>
@@ -30,15 +18,6 @@
       <w:pPr>
         <w:spacing w:after="120"/>
       </w:pPr>
-      <w:r>
-        <w:rPr>
-          <w:b/>
-        </w:rPr>
-        <w:t xml:space="preserve">Notes: </w:t>
-      </w:r>
-      <w:r>
-        <w:t>SHD* denotes experiments where a fraction of the training data was used as a validation set. BHRF used 5%, whereas SE-adLIF used 20%. Rec. indicates recurrent synaptic connections; #Runs is the number of runs with different random seeds. Test accuracy is reported as mean ± SD where available.</w:t>
-      </w:r>
     </w:p>
     <w:tbl>
       <w:tblPr>
@@ -503,11 +482,19 @@
             <w:vAlign w:val="center"/>
           </w:tcPr>
           <w:p>
+            <w:proofErr w:type="spellStart"/>
             <w:r>
               <w:rPr>
                 <w:sz w:val="16"/>
               </w:rPr>
-              <w:t>cAdLIF [24]</w:t>
+              <w:t>cAdLIF</w:t>
+            </w:r>
+            <w:proofErr w:type="spellEnd"/>
+            <w:r>
+              <w:rPr>
+                <w:sz w:val="16"/>
+              </w:rPr>
+              <w:t xml:space="preserve"> [24]</w:t>
             </w:r>
           </w:p>
         </w:tc>
@@ -628,11 +615,19 @@
             <w:vAlign w:val="center"/>
           </w:tcPr>
           <w:p>
+            <w:proofErr w:type="spellStart"/>
             <w:r>
               <w:rPr>
                 <w:sz w:val="16"/>
               </w:rPr>
-              <w:t>RadLIF [16]</w:t>
+              <w:t>RadLIF</w:t>
+            </w:r>
+            <w:proofErr w:type="spellEnd"/>
+            <w:r>
+              <w:rPr>
+                <w:sz w:val="16"/>
+              </w:rPr>
+              <w:t xml:space="preserve"> [16]</w:t>
             </w:r>
           </w:p>
         </w:tc>
@@ -882,7 +877,21 @@
               <w:rPr>
                 <w:sz w:val="16"/>
               </w:rPr>
-              <w:t>EF-adLIF (2 layers)</w:t>
+              <w:t>EF-</w:t>
+            </w:r>
+            <w:proofErr w:type="spellStart"/>
+            <w:r>
+              <w:rPr>
+                <w:sz w:val="16"/>
+              </w:rPr>
+              <w:t>adLIF</w:t>
+            </w:r>
+            <w:proofErr w:type="spellEnd"/>
+            <w:r>
+              <w:rPr>
+                <w:sz w:val="16"/>
+              </w:rPr>
+              <w:t xml:space="preserve"> (2 layers)</w:t>
             </w:r>
           </w:p>
         </w:tc>
@@ -1012,7 +1021,21 @@
               <w:rPr>
                 <w:sz w:val="16"/>
               </w:rPr>
-              <w:t>SE-adLIF (1 layer)</w:t>
+              <w:t>SE-</w:t>
+            </w:r>
+            <w:proofErr w:type="spellStart"/>
+            <w:r>
+              <w:rPr>
+                <w:sz w:val="16"/>
+              </w:rPr>
+              <w:t>adLIF</w:t>
+            </w:r>
+            <w:proofErr w:type="spellEnd"/>
+            <w:r>
+              <w:rPr>
+                <w:sz w:val="16"/>
+              </w:rPr>
+              <w:t xml:space="preserve"> (1 layer)</w:t>
             </w:r>
           </w:p>
         </w:tc>
@@ -1150,7 +1173,23 @@
                 <w:color w:val="C0504D" w:themeColor="accent2"/>
                 <w:sz w:val="16"/>
               </w:rPr>
-              <w:t>SE-adLIF (2 layers)</w:t>
+              <w:t>SE-</w:t>
+            </w:r>
+            <w:proofErr w:type="spellStart"/>
+            <w:r>
+              <w:rPr>
+                <w:color w:val="C0504D" w:themeColor="accent2"/>
+                <w:sz w:val="16"/>
+              </w:rPr>
+              <w:t>adLIF</w:t>
+            </w:r>
+            <w:proofErr w:type="spellEnd"/>
+            <w:r>
+              <w:rPr>
+                <w:color w:val="C0504D" w:themeColor="accent2"/>
+                <w:sz w:val="16"/>
+              </w:rPr>
+              <w:t xml:space="preserve"> (2 layers)</w:t>
             </w:r>
           </w:p>
         </w:tc>
@@ -1661,11 +1700,19 @@
             <w:vAlign w:val="center"/>
           </w:tcPr>
           <w:p>
+            <w:proofErr w:type="spellStart"/>
             <w:r>
               <w:rPr>
                 <w:sz w:val="16"/>
               </w:rPr>
-              <w:t>RadLIF [16]</w:t>
+              <w:t>RadLIF</w:t>
+            </w:r>
+            <w:proofErr w:type="spellEnd"/>
+            <w:r>
+              <w:rPr>
+                <w:sz w:val="16"/>
+              </w:rPr>
+              <w:t xml:space="preserve"> [16]</w:t>
             </w:r>
           </w:p>
         </w:tc>
@@ -1786,11 +1833,19 @@
             <w:vAlign w:val="center"/>
           </w:tcPr>
           <w:p>
+            <w:proofErr w:type="spellStart"/>
             <w:r>
               <w:rPr>
                 <w:sz w:val="16"/>
               </w:rPr>
-              <w:t>cAdLIF [24]</w:t>
+              <w:t>cAdLIF</w:t>
+            </w:r>
+            <w:proofErr w:type="spellEnd"/>
+            <w:r>
+              <w:rPr>
+                <w:sz w:val="16"/>
+              </w:rPr>
+              <w:t xml:space="preserve"> [24]</w:t>
             </w:r>
           </w:p>
         </w:tc>
@@ -2040,7 +2095,21 @@
               <w:rPr>
                 <w:sz w:val="16"/>
               </w:rPr>
-              <w:t>EF-adLIF (2 layers)</w:t>
+              <w:t>EF-</w:t>
+            </w:r>
+            <w:proofErr w:type="spellStart"/>
+            <w:r>
+              <w:rPr>
+                <w:sz w:val="16"/>
+              </w:rPr>
+              <w:t>adLIF</w:t>
+            </w:r>
+            <w:proofErr w:type="spellEnd"/>
+            <w:r>
+              <w:rPr>
+                <w:sz w:val="16"/>
+              </w:rPr>
+              <w:t xml:space="preserve"> (2 layers)</w:t>
             </w:r>
           </w:p>
         </w:tc>
@@ -2166,7 +2235,23 @@
                 <w:color w:val="C0504D" w:themeColor="accent2"/>
                 <w:sz w:val="16"/>
               </w:rPr>
-              <w:t>SE-adLIF (2 layers)</w:t>
+              <w:t>SE-</w:t>
+            </w:r>
+            <w:proofErr w:type="spellStart"/>
+            <w:r>
+              <w:rPr>
+                <w:color w:val="C0504D" w:themeColor="accent2"/>
+                <w:sz w:val="16"/>
+              </w:rPr>
+              <w:t>adLIF</w:t>
+            </w:r>
+            <w:proofErr w:type="spellEnd"/>
+            <w:r>
+              <w:rPr>
+                <w:color w:val="C0504D" w:themeColor="accent2"/>
+                <w:sz w:val="16"/>
+              </w:rPr>
+              <w:t xml:space="preserve"> (2 layers)</w:t>
             </w:r>
           </w:p>
         </w:tc>
@@ -2256,6 +2341,7 @@
             </w:pPr>
             <w:r>
               <w:rPr>
+                <w:color w:val="EE0000"/>
                 <w:sz w:val="16"/>
               </w:rPr>
               <w:t>80.44 ± 0.26</w:t>
@@ -2817,7 +2903,21 @@
               <w:rPr>
                 <w:sz w:val="16"/>
               </w:rPr>
-              <w:t>EF-adLIF (1 layer)</w:t>
+              <w:t>EF-</w:t>
+            </w:r>
+            <w:proofErr w:type="spellStart"/>
+            <w:r>
+              <w:rPr>
+                <w:sz w:val="16"/>
+              </w:rPr>
+              <w:t>adLIF</w:t>
+            </w:r>
+            <w:proofErr w:type="spellEnd"/>
+            <w:r>
+              <w:rPr>
+                <w:sz w:val="16"/>
+              </w:rPr>
+              <w:t xml:space="preserve"> (1 layer)</w:t>
             </w:r>
           </w:p>
         </w:tc>
@@ -2942,7 +3042,21 @@
               <w:rPr>
                 <w:sz w:val="16"/>
               </w:rPr>
-              <w:t>SE-adLIF (1 layer)</w:t>
+              <w:t>SE-</w:t>
+            </w:r>
+            <w:proofErr w:type="spellStart"/>
+            <w:r>
+              <w:rPr>
+                <w:sz w:val="16"/>
+              </w:rPr>
+              <w:t>adLIF</w:t>
+            </w:r>
+            <w:proofErr w:type="spellEnd"/>
+            <w:r>
+              <w:rPr>
+                <w:sz w:val="16"/>
+              </w:rPr>
+              <w:t xml:space="preserve"> (1 layer)</w:t>
             </w:r>
           </w:p>
         </w:tc>
@@ -3067,7 +3181,21 @@
               <w:rPr>
                 <w:sz w:val="16"/>
               </w:rPr>
-              <w:t>EF-adLIF (2 layers)</w:t>
+              <w:t>EF-</w:t>
+            </w:r>
+            <w:proofErr w:type="spellStart"/>
+            <w:r>
+              <w:rPr>
+                <w:sz w:val="16"/>
+              </w:rPr>
+              <w:t>adLIF</w:t>
+            </w:r>
+            <w:proofErr w:type="spellEnd"/>
+            <w:r>
+              <w:rPr>
+                <w:sz w:val="16"/>
+              </w:rPr>
+              <w:t xml:space="preserve"> (2 layers)</w:t>
             </w:r>
           </w:p>
         </w:tc>
@@ -3199,7 +3327,23 @@
                 <w:color w:val="C0504D" w:themeColor="accent2"/>
                 <w:sz w:val="16"/>
               </w:rPr>
-              <w:t>SE-adLIF (2 layers)</w:t>
+              <w:t>SE-</w:t>
+            </w:r>
+            <w:proofErr w:type="spellStart"/>
+            <w:r>
+              <w:rPr>
+                <w:color w:val="C0504D" w:themeColor="accent2"/>
+                <w:sz w:val="16"/>
+              </w:rPr>
+              <w:t>adLIF</w:t>
+            </w:r>
+            <w:proofErr w:type="spellEnd"/>
+            <w:r>
+              <w:rPr>
+                <w:color w:val="C0504D" w:themeColor="accent2"/>
+                <w:sz w:val="16"/>
+              </w:rPr>
+              <w:t xml:space="preserve"> (2 layers)</w:t>
             </w:r>
           </w:p>
         </w:tc>
@@ -3301,6 +3445,7 @@
             </w:pPr>
             <w:r>
               <w:rPr>
+                <w:color w:val="EE0000"/>
                 <w:sz w:val="16"/>
               </w:rPr>
               <w:t>88.18 ± 0.36</w:t>
@@ -3369,6 +3514,12 @@
             <w:pPr>
               <w:jc w:val="center"/>
             </w:pPr>
+            <w:r>
+              <w:rPr>
+                <w:sz w:val="16"/>
+              </w:rPr>
+              <w:t>4.6k</w:t>
+            </w:r>
           </w:p>
         </w:tc>
         <w:tc>
@@ -3406,6 +3557,9 @@
             <w:pPr>
               <w:jc w:val="center"/>
             </w:pPr>
+            <w:r>
+              <w:t>88.32% ± 0.35</w:t>
+            </w:r>
           </w:p>
         </w:tc>
       </w:tr>
@@ -3414,13 +3568,6 @@
       <w:pPr>
         <w:spacing w:before="120"/>
       </w:pPr>
-      <w:r>
-        <w:rPr>
-          <w:i/>
-          <w:sz w:val="16"/>
-        </w:rPr>
-        <w:t>Source: Baronig et al., “Advancing Spatio-Temporal Processing in Spiking Neural Networks through Adaptation,” Nature Communications (2025), Table 2.</w:t>
-      </w:r>
     </w:p>
     <w:sectPr>
       <w:pgSz w:w="16834" w:h="11909" w:orient="landscape"/>

</xml_diff>